<commit_message>
docs: update title page to match НовГУ template layout
https://claude.ai/code/session_01D3hkvTwHu9An1jnGPvHyaS
</commit_message>
<xml_diff>
--- a/пояснительная_записка.docx
+++ b/пояснительная_записка.docx
@@ -5,13 +5,12 @@
     <w:p>
       <w:pPr>
         <w:spacing w:before="0" w:after="0" w:line="360" w:lineRule="auto"/>
-        <w:ind w:firstLine="0"/>
+        <w:ind w:firstLine="0" w:left="1089" w:right="652"/>
         <w:jc w:val="center"/>
       </w:pPr>
       <w:r>
         <w:rPr>
           <w:rFonts w:ascii="Times New Roman" w:hAnsi="Times New Roman"/>
-          <w:b w:val="0"/>
           <w:color w:val="000000"/>
           <w:sz w:val="28"/>
         </w:rPr>
@@ -21,315 +20,426 @@
     <w:p>
       <w:pPr>
         <w:spacing w:before="0" w:after="0" w:line="360" w:lineRule="auto"/>
-        <w:ind w:firstLine="0"/>
+        <w:ind w:firstLine="0" w:left="1089" w:right="652"/>
         <w:jc w:val="center"/>
       </w:pPr>
       <w:r>
         <w:rPr>
           <w:rFonts w:ascii="Times New Roman" w:hAnsi="Times New Roman"/>
-          <w:b w:val="0"/>
           <w:color w:val="000000"/>
           <w:sz w:val="28"/>
         </w:rPr>
         <w:t>Федеральное государственное бюджетное образовательное учреждение</w:t>
         <w:br/>
         <w:t>высшего образования</w:t>
-        <w:br/>
+      </w:r>
+    </w:p>
+    <w:p>
+      <w:pPr>
+        <w:spacing w:before="0" w:after="0" w:line="360" w:lineRule="auto"/>
+        <w:ind w:firstLine="0" w:left="1089" w:right="652"/>
+        <w:jc w:val="center"/>
+      </w:pPr>
+      <w:r>
+        <w:rPr>
+          <w:rFonts w:ascii="Times New Roman" w:hAnsi="Times New Roman"/>
+          <w:color w:val="000000"/>
+          <w:sz w:val="28"/>
+        </w:rPr>
         <w:t>«Новгородский государственный университет имени Ярослава Мудрого»</w:t>
       </w:r>
     </w:p>
     <w:p>
       <w:pPr>
         <w:spacing w:before="0" w:after="0" w:line="360" w:lineRule="auto"/>
+        <w:ind w:firstLine="0" w:left="1089" w:right="652"/>
+        <w:jc w:val="center"/>
+      </w:pPr>
+      <w:r>
+        <w:rPr>
+          <w:rFonts w:ascii="Times New Roman" w:hAnsi="Times New Roman"/>
+          <w:color w:val="000000"/>
+          <w:sz w:val="28"/>
+        </w:rPr>
+        <w:t>Политехнический институт</w:t>
+      </w:r>
+    </w:p>
+    <w:p>
+      <w:pPr>
+        <w:spacing w:before="0" w:after="0" w:line="360" w:lineRule="auto"/>
+        <w:ind w:firstLine="0" w:left="2506"/>
+        <w:jc w:val="center"/>
+      </w:pPr>
+      <w:r>
+        <w:rPr>
+          <w:rFonts w:ascii="Times New Roman" w:hAnsi="Times New Roman"/>
+          <w:color w:val="000000"/>
+          <w:sz w:val="28"/>
+        </w:rPr>
+        <w:t>Кафедра информационных технологий и систем</w:t>
+      </w:r>
+    </w:p>
+    <w:p>
+      <w:pPr>
+        <w:spacing w:before="0" w:after="0"/>
+        <w:ind w:firstLine="0"/>
+        <w:pBdr>
+          <w:bottom w:val="single" w:sz="6" w:space="1" w:color="000000"/>
+        </w:pBdr>
+      </w:pPr>
+    </w:p>
+    <w:p>
+      <w:pPr>
+        <w:spacing w:before="0" w:after="0"/>
+      </w:pPr>
+    </w:p>
+    <w:p>
+      <w:pPr>
+        <w:spacing w:before="0" w:after="0"/>
+      </w:pPr>
+    </w:p>
+    <w:p>
+      <w:pPr>
+        <w:spacing w:before="0" w:after="0"/>
+      </w:pPr>
+    </w:p>
+    <w:p>
+      <w:pPr>
+        <w:spacing w:before="0" w:after="0" w:line="360" w:lineRule="auto"/>
+        <w:ind w:left="6236" w:firstLine="0"/>
+      </w:pPr>
+      <w:r>
+        <w:rPr>
+          <w:rFonts w:ascii="Times New Roman" w:hAnsi="Times New Roman"/>
+          <w:color w:val="000000"/>
+          <w:sz w:val="28"/>
+        </w:rPr>
+        <w:t>УТВЕРЖДАЮ</w:t>
+      </w:r>
+    </w:p>
+    <w:p>
+      <w:pPr>
+        <w:spacing w:before="0" w:after="0" w:line="360" w:lineRule="auto"/>
+        <w:ind w:left="6236" w:firstLine="0"/>
+      </w:pPr>
+      <w:r>
+        <w:rPr>
+          <w:rFonts w:ascii="Times New Roman" w:hAnsi="Times New Roman"/>
+          <w:color w:val="000000"/>
+          <w:sz w:val="28"/>
+        </w:rPr>
+        <w:t>Заведующий кафедрой</w:t>
+      </w:r>
+    </w:p>
+    <w:p>
+      <w:pPr>
+        <w:spacing w:before="120" w:after="0" w:line="360" w:lineRule="auto"/>
+        <w:ind w:left="6236" w:firstLine="0"/>
+        <w:tabs>
+          <w:tab w:val="left" w:pos="7937"/>
+        </w:tabs>
+      </w:pPr>
+      <w:r>
+        <w:rPr>
+          <w:rFonts w:ascii="Times New Roman" w:hAnsi="Times New Roman"/>
+          <w:sz w:val="28"/>
+          <w:u w:val="single"/>
+        </w:rPr>
+        <w:tab/>
+      </w:r>
+      <w:r>
+        <w:rPr>
+          <w:rFonts w:ascii="Times New Roman" w:hAnsi="Times New Roman"/>
+          <w:color w:val="000000"/>
+          <w:sz w:val="28"/>
+        </w:rPr>
+        <w:t>Цымбалюк Л.Н.</w:t>
+      </w:r>
+    </w:p>
+    <w:p>
+      <w:pPr>
+        <w:spacing w:before="120" w:after="0" w:line="360" w:lineRule="auto"/>
+        <w:ind w:left="6236" w:firstLine="0"/>
+      </w:pPr>
+      <w:r>
+        <w:rPr>
+          <w:rFonts w:ascii="Times New Roman" w:hAnsi="Times New Roman"/>
+          <w:color w:val="000000"/>
+          <w:sz w:val="28"/>
+        </w:rPr>
+        <w:t>«____» ____________ 2026 г.</w:t>
+      </w:r>
+    </w:p>
+    <w:p>
+      <w:pPr>
+        <w:spacing w:before="0" w:after="0"/>
+      </w:pPr>
+    </w:p>
+    <w:p>
+      <w:pPr>
+        <w:spacing w:before="0" w:after="0"/>
+      </w:pPr>
+    </w:p>
+    <w:p>
+      <w:pPr>
+        <w:spacing w:before="0" w:after="0"/>
+      </w:pPr>
+    </w:p>
+    <w:p>
+      <w:pPr>
+        <w:spacing w:before="0" w:after="0"/>
+      </w:pPr>
+    </w:p>
+    <w:p>
+      <w:pPr>
+        <w:spacing w:before="0" w:after="0"/>
+      </w:pPr>
+    </w:p>
+    <w:p>
+      <w:pPr>
+        <w:spacing w:before="20" w:after="0" w:line="360" w:lineRule="auto"/>
+        <w:ind w:firstLine="0" w:left="550" w:right="306"/>
+        <w:jc w:val="center"/>
+      </w:pPr>
+      <w:r>
+        <w:rPr>
+          <w:rFonts w:ascii="Times New Roman" w:hAnsi="Times New Roman"/>
+          <w:b/>
+          <w:color w:val="000000"/>
+          <w:sz w:val="28"/>
+        </w:rPr>
+        <w:t>РАЗРАБОТКА ВЕБ-ПРИЛОЖЕНИЯ ДЛЯ ОНЛАЙН-КАТАЛОГА И СИСТЕМЫ УПРАВЛЕНИЯ ЗАКАЗАМИ МАСТЕРСКОЙ СРЕДНЕВЕКОВОГО СНАРЯЖЕНИЯ «КУЗНИЦА КАЛЬРАДИЯ»</w:t>
+      </w:r>
+    </w:p>
+    <w:p>
+      <w:pPr>
+        <w:spacing w:before="0" w:after="0"/>
+      </w:pPr>
+    </w:p>
+    <w:p>
+      <w:pPr>
+        <w:spacing w:before="0" w:after="0" w:line="360" w:lineRule="auto"/>
+        <w:ind w:firstLine="0" w:left="550" w:right="306"/>
+        <w:jc w:val="center"/>
+      </w:pPr>
+      <w:r>
+        <w:rPr>
+          <w:rFonts w:ascii="Times New Roman" w:hAnsi="Times New Roman"/>
+          <w:b w:val="0"/>
+          <w:color w:val="000000"/>
+          <w:sz w:val="28"/>
+        </w:rPr>
+        <w:t>Пояснительная записка к выпускной квалификационной работе</w:t>
+      </w:r>
+    </w:p>
+    <w:p>
+      <w:pPr>
+        <w:spacing w:before="0" w:after="0" w:line="360" w:lineRule="auto"/>
+        <w:ind w:firstLine="0" w:left="351" w:right="102"/>
+        <w:jc w:val="center"/>
+      </w:pPr>
+      <w:r>
+        <w:rPr>
+          <w:rFonts w:ascii="Times New Roman" w:hAnsi="Times New Roman"/>
+          <w:b w:val="0"/>
+          <w:color w:val="000000"/>
+          <w:sz w:val="28"/>
+        </w:rPr>
+        <w:t>по направлению подготовки 09.03.01 Информатика и вычислительная техника направленность (профиль) Программное обеспечение вычислительной техники и автоматизированных систем</w:t>
+      </w:r>
+    </w:p>
+    <w:p>
+      <w:pPr>
+        <w:spacing w:before="0" w:after="0"/>
+      </w:pPr>
+    </w:p>
+    <w:p>
+      <w:pPr>
+        <w:spacing w:before="0" w:after="0"/>
+      </w:pPr>
+    </w:p>
+    <w:p>
+      <w:pPr>
+        <w:spacing w:before="0" w:after="0"/>
+      </w:pPr>
+    </w:p>
+    <w:p>
+      <w:pPr>
+        <w:spacing w:before="0" w:after="0"/>
+      </w:pPr>
+    </w:p>
+    <w:p>
+      <w:pPr>
+        <w:spacing w:before="0" w:after="0"/>
+      </w:pPr>
+    </w:p>
+    <w:p>
+      <w:pPr>
+        <w:spacing w:before="0" w:after="0" w:line="360" w:lineRule="auto"/>
+        <w:ind w:left="6236" w:firstLine="0"/>
+      </w:pPr>
+      <w:r>
+        <w:rPr>
+          <w:rFonts w:ascii="Times New Roman" w:hAnsi="Times New Roman"/>
+          <w:color w:val="000000"/>
+          <w:sz w:val="28"/>
+        </w:rPr>
+        <w:t>Руководитель</w:t>
+      </w:r>
+    </w:p>
+    <w:p>
+      <w:pPr>
+        <w:spacing w:before="120" w:after="0" w:line="360" w:lineRule="auto"/>
+        <w:ind w:left="6236" w:firstLine="0"/>
+        <w:tabs>
+          <w:tab w:val="left" w:pos="7937"/>
+        </w:tabs>
+      </w:pPr>
+      <w:r>
+        <w:rPr>
+          <w:rFonts w:ascii="Times New Roman" w:hAnsi="Times New Roman"/>
+          <w:sz w:val="28"/>
+          <w:u w:val="single"/>
+        </w:rPr>
+        <w:tab/>
+      </w:r>
+      <w:r>
+        <w:rPr>
+          <w:rFonts w:ascii="Times New Roman" w:hAnsi="Times New Roman"/>
+          <w:color w:val="000000"/>
+          <w:sz w:val="28"/>
+        </w:rPr>
+      </w:r>
+    </w:p>
+    <w:p>
+      <w:pPr>
+        <w:spacing w:before="120" w:after="0" w:line="360" w:lineRule="auto"/>
+        <w:ind w:left="6236" w:firstLine="0"/>
+      </w:pPr>
+      <w:r>
+        <w:rPr>
+          <w:rFonts w:ascii="Times New Roman" w:hAnsi="Times New Roman"/>
+          <w:color w:val="000000"/>
+          <w:sz w:val="28"/>
+        </w:rPr>
+        <w:t>«____» ____________ 2026 г.</w:t>
+      </w:r>
+    </w:p>
+    <w:p>
+      <w:pPr>
+        <w:spacing w:before="0" w:after="0"/>
+      </w:pPr>
+    </w:p>
+    <w:p>
+      <w:pPr>
+        <w:spacing w:before="0" w:after="0" w:line="360" w:lineRule="auto"/>
+        <w:ind w:left="6236" w:firstLine="0"/>
+      </w:pPr>
+      <w:r>
+        <w:rPr>
+          <w:rFonts w:ascii="Times New Roman" w:hAnsi="Times New Roman"/>
+          <w:color w:val="000000"/>
+          <w:sz w:val="28"/>
+        </w:rPr>
+        <w:t>Студент группы _____</w:t>
+      </w:r>
+    </w:p>
+    <w:p>
+      <w:pPr>
+        <w:spacing w:before="120" w:after="0" w:line="360" w:lineRule="auto"/>
+        <w:ind w:left="6236" w:firstLine="0"/>
+        <w:tabs>
+          <w:tab w:val="left" w:pos="7937"/>
+        </w:tabs>
+      </w:pPr>
+      <w:r>
+        <w:rPr>
+          <w:rFonts w:ascii="Times New Roman" w:hAnsi="Times New Roman"/>
+          <w:sz w:val="28"/>
+          <w:u w:val="single"/>
+        </w:rPr>
+        <w:tab/>
+      </w:r>
+      <w:r>
+        <w:rPr>
+          <w:rFonts w:ascii="Times New Roman" w:hAnsi="Times New Roman"/>
+          <w:color w:val="000000"/>
+          <w:sz w:val="28"/>
+        </w:rPr>
+      </w:r>
+    </w:p>
+    <w:p>
+      <w:pPr>
+        <w:spacing w:before="120" w:after="0" w:line="360" w:lineRule="auto"/>
+        <w:ind w:left="6236" w:firstLine="0"/>
+      </w:pPr>
+      <w:r>
+        <w:rPr>
+          <w:rFonts w:ascii="Times New Roman" w:hAnsi="Times New Roman"/>
+          <w:color w:val="000000"/>
+          <w:sz w:val="28"/>
+        </w:rPr>
+        <w:t>«____» ____________ 2026 г.</w:t>
+      </w:r>
+    </w:p>
+    <w:p>
+      <w:pPr>
+        <w:spacing w:before="0" w:after="0"/>
+      </w:pPr>
+    </w:p>
+    <w:p>
+      <w:pPr>
+        <w:spacing w:before="0" w:after="0"/>
+      </w:pPr>
+    </w:p>
+    <w:p>
+      <w:pPr>
+        <w:spacing w:before="0" w:after="0"/>
+      </w:pPr>
+    </w:p>
+    <w:p>
+      <w:pPr>
+        <w:spacing w:before="0" w:after="0"/>
+      </w:pPr>
+    </w:p>
+    <w:p>
+      <w:pPr>
+        <w:spacing w:before="0" w:after="0"/>
         <w:ind w:firstLine="0"/>
         <w:jc w:val="center"/>
       </w:pPr>
       <w:r>
         <w:rPr>
           <w:rFonts w:ascii="Times New Roman" w:hAnsi="Times New Roman"/>
-          <w:b w:val="0"/>
           <w:color w:val="000000"/>
           <w:sz w:val="28"/>
         </w:rPr>
-        <w:t>Политехнический институт</w:t>
-      </w:r>
-    </w:p>
-    <w:p>
-      <w:pPr>
-        <w:spacing w:before="0" w:after="480" w:line="360" w:lineRule="auto"/>
+        <w:t>Великий Новгород</w:t>
+      </w:r>
+    </w:p>
+    <w:p>
+      <w:pPr>
         <w:ind w:firstLine="0"/>
         <w:jc w:val="center"/>
       </w:pPr>
       <w:r>
         <w:rPr>
           <w:rFonts w:ascii="Times New Roman" w:hAnsi="Times New Roman"/>
-          <w:b w:val="0"/>
           <w:color w:val="000000"/>
           <w:sz w:val="28"/>
         </w:rPr>
-        <w:t>Кафедра информационных технологий и систем</w:t>
-      </w:r>
-    </w:p>
-    <w:p>
-      <w:pPr>
-        <w:spacing w:before="0" w:after="0" w:line="360" w:lineRule="auto"/>
-        <w:ind w:firstLine="0"/>
-        <w:jc w:val="right"/>
-      </w:pPr>
-      <w:r>
-        <w:rPr>
-          <w:rFonts w:ascii="Times New Roman" w:hAnsi="Times New Roman"/>
-          <w:b w:val="0"/>
-          <w:color w:val="000000"/>
-          <w:sz w:val="28"/>
-        </w:rPr>
-        <w:t>УТВЕРЖДАЮ</w:t>
-      </w:r>
-    </w:p>
-    <w:p>
-      <w:pPr>
-        <w:spacing w:before="0" w:after="0" w:line="360" w:lineRule="auto"/>
-        <w:ind w:firstLine="0"/>
-        <w:jc w:val="right"/>
-      </w:pPr>
-      <w:r>
-        <w:rPr>
-          <w:rFonts w:ascii="Times New Roman" w:hAnsi="Times New Roman"/>
-          <w:b w:val="0"/>
-          <w:color w:val="000000"/>
-          <w:sz w:val="28"/>
-        </w:rPr>
-        <w:t>Зав. кафедрой ИТС</w:t>
-      </w:r>
-    </w:p>
-    <w:p>
-      <w:pPr>
-        <w:spacing w:before="0" w:after="0" w:line="360" w:lineRule="auto"/>
-        <w:ind w:firstLine="0"/>
-        <w:jc w:val="right"/>
-      </w:pPr>
-      <w:r>
-        <w:rPr>
-          <w:rFonts w:ascii="Times New Roman" w:hAnsi="Times New Roman"/>
-          <w:b w:val="0"/>
-          <w:color w:val="000000"/>
-          <w:sz w:val="28"/>
-        </w:rPr>
-        <w:t>____________  ___________________</w:t>
-      </w:r>
-    </w:p>
-    <w:p>
-      <w:pPr>
-        <w:spacing w:before="0" w:after="480" w:line="360" w:lineRule="auto"/>
-        <w:ind w:firstLine="0"/>
-        <w:jc w:val="right"/>
-      </w:pPr>
-      <w:r>
-        <w:rPr>
-          <w:rFonts w:ascii="Times New Roman" w:hAnsi="Times New Roman"/>
-          <w:b w:val="0"/>
-          <w:color w:val="000000"/>
-          <w:sz w:val="28"/>
-        </w:rPr>
-        <w:t>«____» ________________ 2026 г.</w:t>
-      </w:r>
-    </w:p>
-    <w:p>
-      <w:pPr>
-        <w:spacing w:before="0" w:after="0" w:line="360" w:lineRule="auto"/>
-        <w:ind w:firstLine="0"/>
-        <w:jc w:val="center"/>
-      </w:pPr>
-      <w:r>
-        <w:rPr>
-          <w:rFonts w:ascii="Times New Roman" w:hAnsi="Times New Roman"/>
-          <w:b/>
-          <w:color w:val="000000"/>
-          <w:sz w:val="32"/>
-        </w:rPr>
-        <w:t>РАЗРАБОТКА ВЕБ-ПРИЛОЖЕНИЯ ДЛЯ ОНЛАЙН-КАТАЛОГА И СИСТЕМЫ УПРАВЛЕНИЯ ЗАКАЗАМИ МАСТЕРСКОЙ СРЕДНЕВЕКОВОГО СНАРЯЖЕНИЯ «КУЗНИЦА КАЛЬРАДИЯ»</w:t>
-      </w:r>
-    </w:p>
-    <w:p>
-      <w:pPr>
-        <w:spacing w:before="0" w:after="0" w:line="360" w:lineRule="auto"/>
-        <w:ind w:firstLine="0"/>
-        <w:jc w:val="center"/>
-      </w:pPr>
-      <w:r>
-        <w:rPr>
-          <w:rFonts w:ascii="Times New Roman" w:hAnsi="Times New Roman"/>
-          <w:b w:val="0"/>
-          <w:color w:val="000000"/>
-          <w:sz w:val="28"/>
-        </w:rPr>
-        <w:t>Пояснительная записка к выпускной квалификационной работе</w:t>
-      </w:r>
-    </w:p>
-    <w:p>
-      <w:pPr>
-        <w:spacing w:before="0" w:after="240" w:line="360" w:lineRule="auto"/>
-        <w:ind w:firstLine="0"/>
-        <w:jc w:val="center"/>
-      </w:pPr>
-      <w:r>
-        <w:rPr>
-          <w:rFonts w:ascii="Times New Roman" w:hAnsi="Times New Roman"/>
-          <w:b w:val="0"/>
-          <w:color w:val="000000"/>
-          <w:sz w:val="28"/>
-        </w:rPr>
-        <w:t>по направлению подготовки 09.03.01 «Информатика и вычислительная техника»</w:t>
-      </w:r>
-    </w:p>
-    <w:p>
-      <w:pPr>
-        <w:spacing w:before="0" w:after="480" w:line="360" w:lineRule="auto"/>
-        <w:ind w:firstLine="0"/>
-        <w:jc w:val="center"/>
-      </w:pPr>
-      <w:r>
-        <w:rPr>
-          <w:rFonts w:ascii="Times New Roman" w:hAnsi="Times New Roman"/>
-          <w:b w:val="0"/>
-          <w:color w:val="000000"/>
-          <w:sz w:val="28"/>
-        </w:rPr>
-        <w:t>НУОП._____-__ ПЗ</w:t>
-      </w:r>
-    </w:p>
-    <w:p>
-      <w:pPr>
-        <w:spacing w:before="0" w:after="0" w:line="360" w:lineRule="auto"/>
-        <w:ind w:firstLine="0"/>
-        <w:jc w:val="right"/>
-      </w:pPr>
-      <w:r>
-        <w:rPr>
-          <w:rFonts w:ascii="Times New Roman" w:hAnsi="Times New Roman"/>
-          <w:b w:val="0"/>
-          <w:color w:val="000000"/>
-          <w:sz w:val="28"/>
-        </w:rPr>
-        <w:t>Руководитель</w:t>
-      </w:r>
-    </w:p>
-    <w:p>
-      <w:pPr>
-        <w:spacing w:before="0" w:after="0" w:line="360" w:lineRule="auto"/>
-        <w:ind w:firstLine="0"/>
-        <w:jc w:val="right"/>
-      </w:pPr>
-      <w:r>
-        <w:rPr>
-          <w:rFonts w:ascii="Times New Roman" w:hAnsi="Times New Roman"/>
-          <w:b w:val="0"/>
-          <w:color w:val="000000"/>
-          <w:sz w:val="28"/>
-        </w:rPr>
-        <w:t>_____________  ___________________</w:t>
-      </w:r>
-    </w:p>
-    <w:p>
-      <w:pPr>
-        <w:spacing w:before="0" w:after="240" w:line="360" w:lineRule="auto"/>
-        <w:ind w:firstLine="0"/>
-        <w:jc w:val="right"/>
-      </w:pPr>
-      <w:r>
-        <w:rPr>
-          <w:rFonts w:ascii="Times New Roman" w:hAnsi="Times New Roman"/>
-          <w:b w:val="0"/>
-          <w:color w:val="000000"/>
-          <w:sz w:val="28"/>
-        </w:rPr>
-        <w:t>«____» ________________ 2026 г.</w:t>
-      </w:r>
-    </w:p>
-    <w:p>
-      <w:pPr>
-        <w:spacing w:before="0" w:after="0" w:line="360" w:lineRule="auto"/>
-        <w:ind w:firstLine="0"/>
-        <w:jc w:val="right"/>
-      </w:pPr>
-      <w:r>
-        <w:rPr>
-          <w:rFonts w:ascii="Times New Roman" w:hAnsi="Times New Roman"/>
-          <w:b w:val="0"/>
-          <w:color w:val="000000"/>
-          <w:sz w:val="28"/>
-        </w:rPr>
-        <w:t>Студент  группы ____</w:t>
-      </w:r>
-    </w:p>
-    <w:p>
-      <w:pPr>
-        <w:spacing w:before="0" w:after="0" w:line="360" w:lineRule="auto"/>
-        <w:ind w:firstLine="0"/>
-        <w:jc w:val="right"/>
-      </w:pPr>
-      <w:r>
-        <w:rPr>
-          <w:rFonts w:ascii="Times New Roman" w:hAnsi="Times New Roman"/>
-          <w:b w:val="0"/>
-          <w:color w:val="000000"/>
-          <w:sz w:val="28"/>
-        </w:rPr>
-        <w:t>_____________  ___________________</w:t>
-      </w:r>
-    </w:p>
-    <w:p>
-      <w:pPr>
-        <w:spacing w:before="0" w:after="1200" w:line="360" w:lineRule="auto"/>
-        <w:ind w:firstLine="0"/>
-        <w:jc w:val="right"/>
-      </w:pPr>
-      <w:r>
-        <w:rPr>
-          <w:rFonts w:ascii="Times New Roman" w:hAnsi="Times New Roman"/>
-          <w:b w:val="0"/>
-          <w:color w:val="000000"/>
-          <w:sz w:val="28"/>
-        </w:rPr>
-        <w:t>«____» ________________ 2026 г.</w:t>
-      </w:r>
-    </w:p>
-    <w:p>
-      <w:pPr>
-        <w:spacing w:before="0" w:after="0" w:line="360" w:lineRule="auto"/>
-        <w:ind w:firstLine="0"/>
-        <w:jc w:val="center"/>
-      </w:pPr>
-      <w:r>
-        <w:rPr>
-          <w:rFonts w:ascii="Times New Roman" w:hAnsi="Times New Roman"/>
-          <w:b w:val="0"/>
-          <w:color w:val="000000"/>
-          <w:sz w:val="28"/>
-        </w:rPr>
-        <w:t>Великий Новгород</w:t>
-      </w:r>
-    </w:p>
-    <w:p>
-      <w:pPr>
-        <w:spacing w:before="0" w:after="0" w:line="360" w:lineRule="auto"/>
-        <w:ind w:firstLine="0"/>
-        <w:jc w:val="center"/>
-      </w:pPr>
-      <w:r>
-        <w:rPr>
-          <w:rFonts w:ascii="Times New Roman" w:hAnsi="Times New Roman"/>
-          <w:b w:val="0"/>
-          <w:color w:val="000000"/>
-          <w:sz w:val="28"/>
-        </w:rPr>
         <w:t>2026</w:t>
       </w:r>
     </w:p>
     <w:p>
-      <w:r>
-        <w:br w:type="page"/>
-      </w:r>
+      <w:pPr>
+        <w:sectPr>
+          <w:pgSz w:w="12240" w:h="15840"/>
+          <w:pgMar w:top="1060" w:right="425" w:bottom="278" w:left="1134" w:header="720" w:footer="720" w:gutter="0"/>
+          <w:cols w:space="720"/>
+          <w:docGrid w:linePitch="360"/>
+        </w:sectPr>
+      </w:pPr>
     </w:p>
     <w:p>
       <w:pPr>

</xml_diff>